<commit_message>
Worked on multiple merge functions. And added code for Azure deployment.
</commit_message>
<xml_diff>
--- a/project/documents/formaldocuments/StatmentUnder373B.docx
+++ b/project/documents/formaldocuments/StatmentUnder373B.docx
@@ -105,8 +105,8 @@
         </w:rPr>
         <w:t xml:space="preserve"> Patent and Trademark Office; </w:t>
       </w:r>
-      <w:smartTag w:uri="urn:schemas-microsoft-com:office:smarttags" w:element="place">
-        <w:smartTag w:uri="urn:schemas-microsoft-com:office:smarttags" w:element="country-region">
+      <w:smartTag w:uri="urn:schemas-microsoft-com:office:smarttags" w:element="country-region">
+        <w:smartTag w:uri="urn:schemas-microsoft-com:office:smarttags" w:element="place">
           <w:r>
             <w:rPr>
               <w:rFonts w:ascii="Arial" w:hAnsi="Arial" w:cs="Arial"/>
@@ -398,7 +398,21 @@
                 <w:noProof/>
                 <w:u w:val="single"/>
               </w:rPr>
-              <w:t>ssignee&gt;&gt;</w:t>
+              <w:t>ssignee</w:t>
+            </w:r>
+            <w:r>
+              <w:rPr>
+                <w:noProof/>
+                <w:u w:val="single"/>
+              </w:rPr>
+              <w:t>Name</w:t>
+            </w:r>
+            <w:r>
+              <w:rPr>
+                <w:noProof/>
+                <w:u w:val="single"/>
+              </w:rPr>
+              <w:t>&gt;&gt;</w:t>
             </w:r>
             <w:r>
               <w:rPr>
@@ -510,6 +524,9 @@
               <w:instrText xml:space="preserve"> FORMCHECKBOX </w:instrText>
             </w:r>
             <w:r>
+              <w:fldChar w:fldCharType="separate"/>
+            </w:r>
+            <w:r>
               <w:fldChar w:fldCharType="end"/>
             </w:r>
             <w:r>
@@ -558,6 +575,9 @@
               <w:instrText xml:space="preserve"> FORMCHECKBOX </w:instrText>
             </w:r>
             <w:r>
+              <w:fldChar w:fldCharType="separate"/>
+            </w:r>
+            <w:r>
               <w:fldChar w:fldCharType="end"/>
             </w:r>
             <w:bookmarkEnd w:id="2"/>
@@ -627,6 +647,9 @@
               <w:instrText xml:space="preserve"> FORMCHECKBOX </w:instrText>
             </w:r>
             <w:r>
+              <w:fldChar w:fldCharType="separate"/>
+            </w:r>
+            <w:r>
               <w:fldChar w:fldCharType="end"/>
             </w:r>
             <w:r>
@@ -684,6 +707,9 @@
               <w:instrText xml:space="preserve"> FORMCHECKBOX </w:instrText>
             </w:r>
             <w:r>
+              <w:fldChar w:fldCharType="separate"/>
+            </w:r>
+            <w:r>
               <w:fldChar w:fldCharType="end"/>
             </w:r>
             <w:r>
@@ -777,6 +803,9 @@
               <w:instrText xml:space="preserve"> FORMCHECKBOX </w:instrText>
             </w:r>
             <w:r>
+              <w:fldChar w:fldCharType="separate"/>
+            </w:r>
+            <w:r>
               <w:fldChar w:fldCharType="end"/>
             </w:r>
             <w:r>
@@ -1075,6 +1104,9 @@
               <w:instrText xml:space="preserve"> FORMCHECKBOX </w:instrText>
             </w:r>
             <w:r>
+              <w:fldChar w:fldCharType="separate"/>
+            </w:r>
+            <w:r>
               <w:fldChar w:fldCharType="end"/>
             </w:r>
             <w:r>
@@ -1120,6 +1152,9 @@
             </w:r>
             <w:r>
               <w:instrText xml:space="preserve"> FORMCHECKBOX </w:instrText>
+            </w:r>
+            <w:r>
+              <w:fldChar w:fldCharType="separate"/>
             </w:r>
             <w:r>
               <w:fldChar w:fldCharType="end"/>
@@ -1629,6 +1664,50 @@
     <w:lsdException w:name="Subtitle" w:qFormat="1"/>
     <w:lsdException w:name="Strong" w:qFormat="1"/>
     <w:lsdException w:name="Emphasis" w:qFormat="1"/>
+    <w:lsdException w:name="Normal Table" w:semiHidden="1" w:unhideWhenUsed="1"/>
+    <w:lsdException w:name="Table Simple 1" w:semiHidden="1" w:unhideWhenUsed="1"/>
+    <w:lsdException w:name="Table Simple 2" w:semiHidden="1" w:unhideWhenUsed="1"/>
+    <w:lsdException w:name="Table Simple 3" w:semiHidden="1" w:unhideWhenUsed="1"/>
+    <w:lsdException w:name="Table Classic 1" w:semiHidden="1" w:unhideWhenUsed="1"/>
+    <w:lsdException w:name="Table Classic 2" w:semiHidden="1" w:unhideWhenUsed="1"/>
+    <w:lsdException w:name="Table Classic 3" w:semiHidden="1" w:unhideWhenUsed="1"/>
+    <w:lsdException w:name="Table Classic 4" w:semiHidden="1" w:unhideWhenUsed="1"/>
+    <w:lsdException w:name="Table Colorful 1" w:semiHidden="1" w:unhideWhenUsed="1"/>
+    <w:lsdException w:name="Table Colorful 2" w:semiHidden="1" w:unhideWhenUsed="1"/>
+    <w:lsdException w:name="Table Colorful 3" w:semiHidden="1" w:unhideWhenUsed="1"/>
+    <w:lsdException w:name="Table Columns 1" w:semiHidden="1" w:unhideWhenUsed="1"/>
+    <w:lsdException w:name="Table Columns 2" w:semiHidden="1" w:unhideWhenUsed="1"/>
+    <w:lsdException w:name="Table Columns 3" w:semiHidden="1" w:unhideWhenUsed="1"/>
+    <w:lsdException w:name="Table Columns 4" w:semiHidden="1" w:unhideWhenUsed="1"/>
+    <w:lsdException w:name="Table Columns 5" w:semiHidden="1" w:unhideWhenUsed="1"/>
+    <w:lsdException w:name="Table Grid 1" w:semiHidden="1" w:unhideWhenUsed="1"/>
+    <w:lsdException w:name="Table Grid 2" w:semiHidden="1" w:unhideWhenUsed="1"/>
+    <w:lsdException w:name="Table Grid 3" w:semiHidden="1" w:unhideWhenUsed="1"/>
+    <w:lsdException w:name="Table Grid 4" w:semiHidden="1" w:unhideWhenUsed="1"/>
+    <w:lsdException w:name="Table Grid 5" w:semiHidden="1" w:unhideWhenUsed="1"/>
+    <w:lsdException w:name="Table Grid 6" w:semiHidden="1" w:unhideWhenUsed="1"/>
+    <w:lsdException w:name="Table Grid 7" w:semiHidden="1" w:unhideWhenUsed="1"/>
+    <w:lsdException w:name="Table Grid 8" w:semiHidden="1" w:unhideWhenUsed="1"/>
+    <w:lsdException w:name="Table List 1" w:semiHidden="1" w:unhideWhenUsed="1"/>
+    <w:lsdException w:name="Table List 2" w:semiHidden="1" w:unhideWhenUsed="1"/>
+    <w:lsdException w:name="Table List 3" w:semiHidden="1" w:unhideWhenUsed="1"/>
+    <w:lsdException w:name="Table List 4" w:semiHidden="1" w:unhideWhenUsed="1"/>
+    <w:lsdException w:name="Table List 5" w:semiHidden="1" w:unhideWhenUsed="1"/>
+    <w:lsdException w:name="Table List 6" w:semiHidden="1" w:unhideWhenUsed="1"/>
+    <w:lsdException w:name="Table List 7" w:semiHidden="1" w:unhideWhenUsed="1"/>
+    <w:lsdException w:name="Table List 8" w:semiHidden="1" w:unhideWhenUsed="1"/>
+    <w:lsdException w:name="Table 3D effects 1" w:semiHidden="1" w:unhideWhenUsed="1"/>
+    <w:lsdException w:name="Table 3D effects 2" w:semiHidden="1" w:unhideWhenUsed="1"/>
+    <w:lsdException w:name="Table 3D effects 3" w:semiHidden="1" w:unhideWhenUsed="1"/>
+    <w:lsdException w:name="Table Contemporary" w:semiHidden="1" w:unhideWhenUsed="1"/>
+    <w:lsdException w:name="Table Elegant" w:semiHidden="1" w:unhideWhenUsed="1"/>
+    <w:lsdException w:name="Table Professional" w:semiHidden="1" w:unhideWhenUsed="1"/>
+    <w:lsdException w:name="Table Subtle 1" w:semiHidden="1" w:unhideWhenUsed="1"/>
+    <w:lsdException w:name="Table Subtle 2" w:semiHidden="1" w:unhideWhenUsed="1"/>
+    <w:lsdException w:name="Table Web 1" w:semiHidden="1" w:unhideWhenUsed="1"/>
+    <w:lsdException w:name="Table Web 2" w:semiHidden="1" w:unhideWhenUsed="1"/>
+    <w:lsdException w:name="Table Web 3" w:semiHidden="1" w:unhideWhenUsed="1"/>
+    <w:lsdException w:name="Table Theme" w:semiHidden="1" w:unhideWhenUsed="1"/>
     <w:lsdException w:name="Placeholder Text" w:semiHidden="1" w:uiPriority="99"/>
     <w:lsdException w:name="No Spacing" w:uiPriority="1" w:qFormat="1"/>
     <w:lsdException w:name="Light Shading" w:uiPriority="60"/>

</xml_diff>